<commit_message>
Keep every storyboard PDF on A4, with no block crossing a page break.
Co-authored-by: Cursor <cursoragent@cursor.com>
</commit_message>
<xml_diff>
--- a/Articulate assets/Storyboard Master/Storyboard Master - blank.docx
+++ b/Articulate assets/Storyboard Master/Storyboard Master - blank.docx
@@ -6,7 +6,7 @@
     <w:p>
       <w:pPr>
         <w:shd w:val="clear" w:color="auto" w:fill="E6E6E6"/>
-        <w:divId w:val="273367733"/>
+        <w:divId w:val="67268497"/>
         <w:rPr>
           <w:rFonts w:ascii="League Gothic" w:eastAsia="Times New Roman" w:hAnsi="League Gothic"/>
           <w:caps/>
@@ -48,7 +48,7 @@
       </w:tblGrid>
       <w:tr>
         <w:trPr>
-          <w:divId w:val="726219468"/>
+          <w:divId w:val="1008024843"/>
           <w:cantSplit/>
           <w:trHeight w:hRule="exact" w:val="160"/>
         </w:trPr>
@@ -119,7 +119,7 @@
       </w:tr>
       <w:tr>
         <w:trPr>
-          <w:divId w:val="726219468"/>
+          <w:divId w:val="1008024843"/>
           <w:cantSplit/>
         </w:trPr>
         <w:tc>
@@ -192,7 +192,7 @@
       </w:tr>
       <w:tr>
         <w:trPr>
-          <w:divId w:val="726219468"/>
+          <w:divId w:val="1008024843"/>
           <w:cantSplit/>
         </w:trPr>
         <w:tc>
@@ -265,7 +265,7 @@
       </w:tr>
       <w:tr>
         <w:trPr>
-          <w:divId w:val="726219468"/>
+          <w:divId w:val="1008024843"/>
           <w:cantSplit/>
         </w:trPr>
         <w:tc>
@@ -338,7 +338,7 @@
       </w:tr>
       <w:tr>
         <w:trPr>
-          <w:divId w:val="726219468"/>
+          <w:divId w:val="1008024843"/>
           <w:cantSplit/>
         </w:trPr>
         <w:tc>
@@ -411,7 +411,7 @@
       </w:tr>
       <w:tr>
         <w:trPr>
-          <w:divId w:val="726219468"/>
+          <w:divId w:val="1008024843"/>
           <w:cantSplit/>
         </w:trPr>
         <w:tc>
@@ -484,7 +484,7 @@
       </w:tr>
       <w:tr>
         <w:trPr>
-          <w:divId w:val="726219468"/>
+          <w:divId w:val="1008024843"/>
           <w:cantSplit/>
         </w:trPr>
         <w:tc>
@@ -557,7 +557,7 @@
       </w:tr>
       <w:tr>
         <w:trPr>
-          <w:divId w:val="726219468"/>
+          <w:divId w:val="1008024843"/>
           <w:cantSplit/>
         </w:trPr>
         <w:tc>
@@ -753,7 +753,7 @@
                 <w:p>
                   <w:pPr>
                     <w:pStyle w:val="type-note"/>
-                    <w:divId w:val="1292860900"/>
+                    <w:divId w:val="1430195788"/>
                   </w:pPr>
                   <w:r>
                     <w:t>Document name · League Gothic · 22px · ink · UPPER CASE</w:t>
@@ -762,7 +762,7 @@
                 <w:p>
                   <w:pPr>
                     <w:pStyle w:val="doc-name"/>
-                    <w:divId w:val="1292860900"/>
+                    <w:divId w:val="1430195788"/>
                   </w:pPr>
                   <w:r>
                     <w:t>DOCUMENT NAME</w:t>
@@ -771,7 +771,7 @@
                 <w:p>
                   <w:pPr>
                     <w:pStyle w:val="type-note"/>
-                    <w:divId w:val="827093537"/>
+                    <w:divId w:val="159661969"/>
                   </w:pPr>
                   <w:r>
                     <w:t>Main Header (H1) · Open Sauce One 600 · 28px · ink · Upper and lower case</w:t>
@@ -780,7 +780,7 @@
                 <w:p>
                   <w:pPr>
                     <w:pStyle w:val="main-title"/>
-                    <w:divId w:val="827093537"/>
+                    <w:divId w:val="159661969"/>
                   </w:pPr>
                   <w:r>
                     <w:t>Main Header (H1)</w:t>
@@ -789,7 +789,7 @@
                 <w:p>
                   <w:pPr>
                     <w:pStyle w:val="type-note"/>
-                    <w:divId w:val="2072147846"/>
+                    <w:divId w:val="914628122"/>
                   </w:pPr>
                   <w:r>
                     <w:t>Object Title · League Gothic · 20px · ink · Upper and lower case</w:t>
@@ -798,7 +798,7 @@
                 <w:p>
                   <w:pPr>
                     <w:pStyle w:val="object-title"/>
-                    <w:divId w:val="2072147846"/>
+                    <w:divId w:val="914628122"/>
                   </w:pPr>
                   <w:r>
                     <w:t>Object Title</w:t>
@@ -807,7 +807,7 @@
                 <w:p>
                   <w:pPr>
                     <w:pStyle w:val="type-note"/>
-                    <w:divId w:val="1751463251"/>
+                    <w:divId w:val="1778793816"/>
                   </w:pPr>
                   <w:r>
                     <w:t>Subhead · Open Sauce One 500 · 14pt · ink · Upper and lower case</w:t>
@@ -816,7 +816,7 @@
                 <w:p>
                   <w:pPr>
                     <w:pStyle w:val="medium"/>
-                    <w:divId w:val="1751463251"/>
+                    <w:divId w:val="1778793816"/>
                   </w:pPr>
                   <w:r>
                     <w:t>Subhead</w:t>
@@ -825,7 +825,7 @@
                 <w:p>
                   <w:pPr>
                     <w:pStyle w:val="type-note"/>
-                    <w:divId w:val="1354111455"/>
+                    <w:divId w:val="1978297387"/>
                   </w:pPr>
                   <w:r>
                     <w:t>Body Text (body) · Open Sauce One 400 · 11pt · line-height 1.5 · ink · Upper and lower case</w:t>
@@ -834,7 +834,7 @@
                 <w:p>
                   <w:pPr>
                     <w:pStyle w:val="body-sample"/>
-                    <w:divId w:val="1354111455"/>
+                    <w:divId w:val="1978297387"/>
                   </w:pPr>
                   <w:r>
                     <w:t>Body Text (body)</w:t>
@@ -843,7 +843,7 @@
                 <w:p>
                   <w:pPr>
                     <w:pStyle w:val="body-sample"/>
-                    <w:divId w:val="1354111455"/>
+                    <w:divId w:val="1978297387"/>
                   </w:pPr>
                   <w:r>
                     <w:t>Lorem ipsum dolor sit amet, consectetur adipiscing elit. Sed do eiusmod tempor incididunt ut labore et dolore magna aliqua. Ut enim ad minim veniam, quis nostrud exercitation ullamco laboris nisi ut aliquip ex ea commodo consequat.</w:t>
@@ -852,7 +852,7 @@
                 <w:p>
                   <w:pPr>
                     <w:pStyle w:val="type-note"/>
-                    <w:divId w:val="201787915"/>
+                    <w:divId w:val="1245453295"/>
                   </w:pPr>
                   <w:r>
                     <w:t>Button · Open Sauce One 500 · 11pt · ink · Upper and lower case</w:t>
@@ -861,7 +861,7 @@
                 <w:p>
                   <w:pPr>
                     <w:pStyle w:val="NormalWeb"/>
-                    <w:divId w:val="201787915"/>
+                    <w:divId w:val="1245453295"/>
                     <w:rPr>
                       <w:color w:val="3B3B3B"/>
                     </w:rPr>
@@ -876,7 +876,7 @@
                 <w:p>
                   <w:pPr>
                     <w:pStyle w:val="type-note"/>
-                    <w:divId w:val="1696229191"/>
+                    <w:divId w:val="811747884"/>
                   </w:pPr>
                   <w:r>
                     <w:t>Caption · Open Sauce One 400 · 9.5pt · ink · Upper and lower case</w:t>
@@ -885,7 +885,7 @@
                 <w:p>
                   <w:pPr>
                     <w:pStyle w:val="caption-sample"/>
-                    <w:divId w:val="1696229191"/>
+                    <w:divId w:val="811747884"/>
                   </w:pPr>
                   <w:r>
                     <w:t>Caption</w:t>
@@ -1573,6 +1573,387 @@
     <w:p>
       <w:pPr>
         <w:pStyle w:val="card-title"/>
+        <w:keepLines/>
+        <w:rPr>
+          <w:lang w:val="en"/>
+        </w:rPr>
+      </w:pPr>
+      <w:r>
+        <w:rPr>
+          <w:rFonts w:eastAsia="Times New Roman"/>
+          <w:lang w:val="en"/>
+        </w:rPr>
+        <w:br w:type="page"/>
+      </w:r>
+      <w:r>
+        <w:rPr>
+          <w:lang w:val="en"/>
+        </w:rPr>
+        <w:lastRenderedPageBreak/>
+        <w:t>Production assets</w:t>
+      </w:r>
+    </w:p>
+    <w:tbl>
+      <w:tblPr>
+        <w:tblW w:w="15399" w:type="dxa"/>
+        <w:tblLayout w:type="fixed"/>
+        <w:tblCellMar>
+          <w:top w:w="120" w:type="dxa"/>
+          <w:left w:w="160" w:type="dxa"/>
+          <w:bottom w:w="120" w:type="dxa"/>
+          <w:right w:w="160" w:type="dxa"/>
+        </w:tblCellMar>
+        <w:tblLook w:val="04A0" w:firstRow="1" w:lastRow="0" w:firstColumn="1" w:lastColumn="0" w:noHBand="0" w:noVBand="1"/>
+      </w:tblPr>
+      <w:tblGrid>
+        <w:gridCol w:w="3380"/>
+        <w:gridCol w:w="4300"/>
+        <w:gridCol w:w="5220"/>
+        <w:gridCol w:w="2499"/>
+      </w:tblGrid>
+      <w:tr>
+        <w:trPr>
+          <w:cantSplit/>
+          <w:tblHeader/>
+        </w:trPr>
+        <w:tc>
+          <w:tcPr>
+            <w:tcW w:w="3380" w:type="dxa"/>
+            <w:tcBorders>
+              <w:top w:val="single" w:sz="6" w:space="0" w:color="3B3B3B"/>
+              <w:left w:val="single" w:sz="6" w:space="0" w:color="3B3B3B"/>
+              <w:bottom w:val="single" w:sz="6" w:space="0" w:color="3B3B3B"/>
+              <w:right w:val="single" w:sz="6" w:space="0" w:color="3B3B3B"/>
+            </w:tcBorders>
+            <w:shd w:val="clear" w:color="auto" w:fill="E6E6E6"/>
+            <w:tcMar>
+              <w:top w:w="105" w:type="dxa"/>
+              <w:left w:w="120" w:type="dxa"/>
+              <w:bottom w:w="105" w:type="dxa"/>
+              <w:right w:w="120" w:type="dxa"/>
+            </w:tcMar>
+            <w:hideMark/>
+          </w:tcPr>
+          <w:p>
+            <w:pPr>
+              <w:keepNext/>
+              <w:keepLines/>
+              <w:rPr>
+                <w:rFonts w:ascii="Calibri" w:eastAsia="Times New Roman" w:hAnsi="Calibri" w:cs="Calibri"/>
+                <w:b/>
+                <w:bCs/>
+                <w:color w:val="3B3B3B"/>
+                <w:sz w:val="32"/>
+                <w:szCs w:val="32"/>
+              </w:rPr>
+            </w:pPr>
+            <w:r>
+              <w:rPr>
+                <w:rFonts w:ascii="Calibri" w:eastAsia="Times New Roman" w:hAnsi="Calibri" w:cs="Calibri"/>
+                <w:b/>
+                <w:bCs/>
+                <w:color w:val="3B3B3B"/>
+                <w:sz w:val="32"/>
+                <w:szCs w:val="32"/>
+              </w:rPr>
+              <w:t>Name</w:t>
+            </w:r>
+          </w:p>
+        </w:tc>
+        <w:tc>
+          <w:tcPr>
+            <w:tcW w:w="4300" w:type="dxa"/>
+            <w:tcBorders>
+              <w:top w:val="single" w:sz="6" w:space="0" w:color="3B3B3B"/>
+              <w:left w:val="single" w:sz="6" w:space="0" w:color="3B3B3B"/>
+              <w:bottom w:val="single" w:sz="6" w:space="0" w:color="3B3B3B"/>
+              <w:right w:val="single" w:sz="6" w:space="0" w:color="3B3B3B"/>
+            </w:tcBorders>
+            <w:shd w:val="clear" w:color="auto" w:fill="E6E6E6"/>
+            <w:tcMar>
+              <w:top w:w="105" w:type="dxa"/>
+              <w:left w:w="120" w:type="dxa"/>
+              <w:bottom w:w="105" w:type="dxa"/>
+              <w:right w:w="120" w:type="dxa"/>
+            </w:tcMar>
+            <w:hideMark/>
+          </w:tcPr>
+          <w:p>
+            <w:pPr>
+              <w:keepNext/>
+              <w:keepLines/>
+              <w:rPr>
+                <w:rFonts w:ascii="Calibri" w:eastAsia="Times New Roman" w:hAnsi="Calibri" w:cs="Calibri"/>
+                <w:b/>
+                <w:bCs/>
+                <w:color w:val="3B3B3B"/>
+                <w:sz w:val="32"/>
+                <w:szCs w:val="32"/>
+              </w:rPr>
+            </w:pPr>
+            <w:r>
+              <w:rPr>
+                <w:rFonts w:ascii="Calibri" w:eastAsia="Times New Roman" w:hAnsi="Calibri" w:cs="Calibri"/>
+                <w:b/>
+                <w:bCs/>
+                <w:color w:val="3B3B3B"/>
+                <w:sz w:val="32"/>
+                <w:szCs w:val="32"/>
+              </w:rPr>
+              <w:t>What it is</w:t>
+            </w:r>
+          </w:p>
+        </w:tc>
+        <w:tc>
+          <w:tcPr>
+            <w:tcW w:w="5220" w:type="dxa"/>
+            <w:tcBorders>
+              <w:top w:val="single" w:sz="6" w:space="0" w:color="3B3B3B"/>
+              <w:left w:val="single" w:sz="6" w:space="0" w:color="3B3B3B"/>
+              <w:bottom w:val="single" w:sz="6" w:space="0" w:color="3B3B3B"/>
+              <w:right w:val="single" w:sz="6" w:space="0" w:color="3B3B3B"/>
+            </w:tcBorders>
+            <w:shd w:val="clear" w:color="auto" w:fill="E6E6E6"/>
+            <w:tcMar>
+              <w:top w:w="105" w:type="dxa"/>
+              <w:left w:w="120" w:type="dxa"/>
+              <w:bottom w:w="105" w:type="dxa"/>
+              <w:right w:w="120" w:type="dxa"/>
+            </w:tcMar>
+            <w:hideMark/>
+          </w:tcPr>
+          <w:p>
+            <w:pPr>
+              <w:keepNext/>
+              <w:keepLines/>
+              <w:rPr>
+                <w:rFonts w:ascii="Calibri" w:eastAsia="Times New Roman" w:hAnsi="Calibri" w:cs="Calibri"/>
+                <w:b/>
+                <w:bCs/>
+                <w:color w:val="3B3B3B"/>
+                <w:sz w:val="32"/>
+                <w:szCs w:val="32"/>
+              </w:rPr>
+            </w:pPr>
+            <w:r>
+              <w:rPr>
+                <w:rFonts w:ascii="Calibri" w:eastAsia="Times New Roman" w:hAnsi="Calibri" w:cs="Calibri"/>
+                <w:b/>
+                <w:bCs/>
+                <w:color w:val="3B3B3B"/>
+                <w:sz w:val="32"/>
+                <w:szCs w:val="32"/>
+              </w:rPr>
+              <w:t>Where it is used</w:t>
+            </w:r>
+          </w:p>
+        </w:tc>
+        <w:tc>
+          <w:tcPr>
+            <w:tcW w:w="2499" w:type="dxa"/>
+            <w:tcBorders>
+              <w:top w:val="single" w:sz="6" w:space="0" w:color="3B3B3B"/>
+              <w:left w:val="single" w:sz="6" w:space="0" w:color="3B3B3B"/>
+              <w:bottom w:val="single" w:sz="6" w:space="0" w:color="3B3B3B"/>
+              <w:right w:val="single" w:sz="6" w:space="0" w:color="3B3B3B"/>
+            </w:tcBorders>
+            <w:shd w:val="clear" w:color="auto" w:fill="E6E6E6"/>
+            <w:tcMar>
+              <w:top w:w="105" w:type="dxa"/>
+              <w:left w:w="120" w:type="dxa"/>
+              <w:bottom w:w="105" w:type="dxa"/>
+              <w:right w:w="120" w:type="dxa"/>
+            </w:tcMar>
+            <w:hideMark/>
+          </w:tcPr>
+          <w:p>
+            <w:pPr>
+              <w:keepNext/>
+              <w:keepLines/>
+              <w:rPr>
+                <w:rFonts w:ascii="Calibri" w:eastAsia="Times New Roman" w:hAnsi="Calibri" w:cs="Calibri"/>
+                <w:b/>
+                <w:bCs/>
+                <w:color w:val="3B3B3B"/>
+                <w:sz w:val="32"/>
+                <w:szCs w:val="32"/>
+              </w:rPr>
+            </w:pPr>
+            <w:r>
+              <w:rPr>
+                <w:rFonts w:ascii="Calibri" w:eastAsia="Times New Roman" w:hAnsi="Calibri" w:cs="Calibri"/>
+                <w:b/>
+                <w:bCs/>
+                <w:color w:val="3B3B3B"/>
+                <w:sz w:val="32"/>
+                <w:szCs w:val="32"/>
+              </w:rPr>
+              <w:t>Status</w:t>
+            </w:r>
+          </w:p>
+        </w:tc>
+      </w:tr>
+      <w:tr>
+        <w:trPr>
+          <w:cantSplit/>
+        </w:trPr>
+        <w:tc>
+          <w:tcPr>
+            <w:tcW w:w="3380" w:type="dxa"/>
+            <w:tcBorders>
+              <w:top w:val="single" w:sz="6" w:space="0" w:color="3B3B3B"/>
+              <w:left w:val="single" w:sz="6" w:space="0" w:color="3B3B3B"/>
+              <w:bottom w:val="single" w:sz="6" w:space="0" w:color="3B3B3B"/>
+              <w:right w:val="single" w:sz="6" w:space="0" w:color="3B3B3B"/>
+            </w:tcBorders>
+            <w:tcMar>
+              <w:top w:w="105" w:type="dxa"/>
+              <w:left w:w="120" w:type="dxa"/>
+              <w:bottom w:w="105" w:type="dxa"/>
+              <w:right w:w="120" w:type="dxa"/>
+            </w:tcMar>
+            <w:hideMark/>
+          </w:tcPr>
+          <w:p>
+            <w:pPr>
+              <w:keepLines/>
+              <w:rPr>
+                <w:rFonts w:ascii="Calibri" w:eastAsia="Times New Roman" w:hAnsi="Calibri" w:cs="Calibri"/>
+                <w:color w:val="3B3B3B"/>
+                <w:sz w:val="28"/>
+                <w:szCs w:val="28"/>
+              </w:rPr>
+            </w:pPr>
+            <w:r>
+              <w:rPr>
+                <w:rFonts w:ascii="Calibri" w:eastAsia="Times New Roman" w:hAnsi="Calibri" w:cs="Calibri"/>
+                <w:color w:val="3B3B3B"/>
+                <w:sz w:val="28"/>
+                <w:szCs w:val="28"/>
+              </w:rPr>
+              <w:t>[Name]</w:t>
+            </w:r>
+          </w:p>
+        </w:tc>
+        <w:tc>
+          <w:tcPr>
+            <w:tcW w:w="4300" w:type="dxa"/>
+            <w:tcBorders>
+              <w:top w:val="single" w:sz="6" w:space="0" w:color="3B3B3B"/>
+              <w:left w:val="single" w:sz="6" w:space="0" w:color="3B3B3B"/>
+              <w:bottom w:val="single" w:sz="6" w:space="0" w:color="3B3B3B"/>
+              <w:right w:val="single" w:sz="6" w:space="0" w:color="3B3B3B"/>
+            </w:tcBorders>
+            <w:tcMar>
+              <w:top w:w="105" w:type="dxa"/>
+              <w:left w:w="120" w:type="dxa"/>
+              <w:bottom w:w="105" w:type="dxa"/>
+              <w:right w:w="120" w:type="dxa"/>
+            </w:tcMar>
+            <w:hideMark/>
+          </w:tcPr>
+          <w:p>
+            <w:pPr>
+              <w:keepLines/>
+              <w:rPr>
+                <w:rFonts w:ascii="Calibri" w:eastAsia="Times New Roman" w:hAnsi="Calibri" w:cs="Calibri"/>
+                <w:color w:val="3B3B3B"/>
+                <w:sz w:val="28"/>
+                <w:szCs w:val="28"/>
+              </w:rPr>
+            </w:pPr>
+            <w:r>
+              <w:rPr>
+                <w:rFonts w:ascii="Calibri" w:eastAsia="Times New Roman" w:hAnsi="Calibri" w:cs="Calibri"/>
+                <w:color w:val="3B3B3B"/>
+                <w:sz w:val="28"/>
+                <w:szCs w:val="28"/>
+              </w:rPr>
+              <w:t>[What it is]</w:t>
+            </w:r>
+          </w:p>
+        </w:tc>
+        <w:tc>
+          <w:tcPr>
+            <w:tcW w:w="5220" w:type="dxa"/>
+            <w:tcBorders>
+              <w:top w:val="single" w:sz="6" w:space="0" w:color="3B3B3B"/>
+              <w:left w:val="single" w:sz="6" w:space="0" w:color="3B3B3B"/>
+              <w:bottom w:val="single" w:sz="6" w:space="0" w:color="3B3B3B"/>
+              <w:right w:val="single" w:sz="6" w:space="0" w:color="3B3B3B"/>
+            </w:tcBorders>
+            <w:tcMar>
+              <w:top w:w="105" w:type="dxa"/>
+              <w:left w:w="120" w:type="dxa"/>
+              <w:bottom w:w="105" w:type="dxa"/>
+              <w:right w:w="120" w:type="dxa"/>
+            </w:tcMar>
+            <w:hideMark/>
+          </w:tcPr>
+          <w:p>
+            <w:pPr>
+              <w:keepLines/>
+              <w:rPr>
+                <w:rFonts w:ascii="Calibri" w:eastAsia="Times New Roman" w:hAnsi="Calibri" w:cs="Calibri"/>
+                <w:color w:val="3B3B3B"/>
+                <w:sz w:val="28"/>
+                <w:szCs w:val="28"/>
+              </w:rPr>
+            </w:pPr>
+            <w:r>
+              <w:rPr>
+                <w:rFonts w:ascii="Calibri" w:eastAsia="Times New Roman" w:hAnsi="Calibri" w:cs="Calibri"/>
+                <w:color w:val="3B3B3B"/>
+                <w:sz w:val="28"/>
+                <w:szCs w:val="28"/>
+              </w:rPr>
+              <w:t>[Blocks, scenes, slides, or layers]</w:t>
+            </w:r>
+          </w:p>
+        </w:tc>
+        <w:tc>
+          <w:tcPr>
+            <w:tcW w:w="2499" w:type="dxa"/>
+            <w:tcBorders>
+              <w:top w:val="single" w:sz="6" w:space="0" w:color="3B3B3B"/>
+              <w:left w:val="single" w:sz="6" w:space="0" w:color="3B3B3B"/>
+              <w:bottom w:val="single" w:sz="6" w:space="0" w:color="3B3B3B"/>
+              <w:right w:val="single" w:sz="6" w:space="0" w:color="3B3B3B"/>
+            </w:tcBorders>
+            <w:tcMar>
+              <w:top w:w="105" w:type="dxa"/>
+              <w:left w:w="120" w:type="dxa"/>
+              <w:bottom w:w="105" w:type="dxa"/>
+              <w:right w:w="120" w:type="dxa"/>
+            </w:tcMar>
+            <w:hideMark/>
+          </w:tcPr>
+          <w:p>
+            <w:pPr>
+              <w:keepLines/>
+              <w:rPr>
+                <w:rFonts w:ascii="Calibri" w:eastAsia="Times New Roman" w:hAnsi="Calibri" w:cs="Calibri"/>
+                <w:color w:val="3B3B3B"/>
+                <w:sz w:val="28"/>
+                <w:szCs w:val="28"/>
+              </w:rPr>
+            </w:pPr>
+            <w:r>
+              <w:rPr>
+                <w:rFonts w:ascii="Calibri" w:eastAsia="Times New Roman" w:hAnsi="Calibri" w:cs="Calibri"/>
+                <w:color w:val="3B3B3B"/>
+                <w:sz w:val="28"/>
+                <w:szCs w:val="28"/>
+              </w:rPr>
+              <w:t>[In hand / Client supplies / Still to make]</w:t>
+            </w:r>
+          </w:p>
+        </w:tc>
+      </w:tr>
+    </w:tbl>
+    <w:p>
+      <w:pPr>
+        <w:pStyle w:val="card-title"/>
         <w:rPr>
           <w:lang w:val="en"/>
         </w:rPr>
@@ -1596,7 +1977,7 @@
       <w:pPr>
         <w:pStyle w:val="card-title"/>
         <w:keepLines/>
-        <w:divId w:val="383257534"/>
+        <w:divId w:val="1033926233"/>
         <w:rPr>
           <w:lang w:val="en"/>
         </w:rPr>
@@ -1626,7 +2007,7 @@
       </w:tblGrid>
       <w:tr>
         <w:trPr>
-          <w:divId w:val="383257534"/>
+          <w:divId w:val="1033926233"/>
           <w:cantSplit/>
         </w:trPr>
         <w:tc>
@@ -1708,14 +2089,14 @@
                 <w:sz w:val="28"/>
                 <w:szCs w:val="28"/>
               </w:rPr>
-              <w:t>[Only assets this slide uses.]</w:t>
+              <w:t>[Name from the production asset list]</w:t>
             </w:r>
           </w:p>
         </w:tc>
       </w:tr>
       <w:tr>
         <w:trPr>
-          <w:divId w:val="383257534"/>
+          <w:divId w:val="1033926233"/>
           <w:cantSplit/>
         </w:trPr>
         <w:tc>
@@ -1804,7 +2185,7 @@
       </w:tr>
       <w:tr>
         <w:trPr>
-          <w:divId w:val="383257534"/>
+          <w:divId w:val="1033926233"/>
           <w:cantSplit/>
         </w:trPr>
         <w:tc>
@@ -1893,7 +2274,7 @@
       </w:tr>
       <w:tr>
         <w:trPr>
-          <w:divId w:val="383257534"/>
+          <w:divId w:val="1033926233"/>
           <w:cantSplit/>
         </w:trPr>
         <w:tc>
@@ -1999,7 +2380,7 @@
       <w:pPr>
         <w:pStyle w:val="card-title"/>
         <w:keepLines/>
-        <w:divId w:val="208760049"/>
+        <w:divId w:val="45377860"/>
         <w:rPr>
           <w:lang w:val="en"/>
         </w:rPr>
@@ -2029,7 +2410,7 @@
       </w:tblGrid>
       <w:tr>
         <w:trPr>
-          <w:divId w:val="208760049"/>
+          <w:divId w:val="45377860"/>
           <w:cantSplit/>
         </w:trPr>
         <w:tc>
@@ -2118,7 +2499,7 @@
       </w:tr>
       <w:tr>
         <w:trPr>
-          <w:divId w:val="208760049"/>
+          <w:divId w:val="45377860"/>
           <w:cantSplit/>
         </w:trPr>
         <w:tc>
@@ -2207,7 +2588,7 @@
       </w:tr>
       <w:tr>
         <w:trPr>
-          <w:divId w:val="208760049"/>
+          <w:divId w:val="45377860"/>
           <w:cantSplit/>
         </w:trPr>
         <w:tc>
@@ -2296,7 +2677,7 @@
       </w:tr>
       <w:tr>
         <w:trPr>
-          <w:divId w:val="208760049"/>
+          <w:divId w:val="45377860"/>
           <w:cantSplit/>
         </w:trPr>
         <w:tc>
@@ -2504,7 +2885,7 @@
         <w:color w:val="3B3B3B"/>
         <w:sz w:val="28"/>
       </w:rPr>
-      <w:t>3</w:t>
+      <w:t>1</w:t>
     </w:r>
     <w:r>
       <w:rPr>
@@ -3479,6 +3860,22 @@
     <w:name w:val="ix"/>
     <w:basedOn w:val="Normal"/>
   </w:style>
+  <w:style w:type="paragraph" w:customStyle="1" w:styleId="name">
+    <w:name w:val="name"/>
+    <w:basedOn w:val="Normal"/>
+  </w:style>
+  <w:style w:type="paragraph" w:customStyle="1" w:styleId="what">
+    <w:name w:val="what"/>
+    <w:basedOn w:val="Normal"/>
+  </w:style>
+  <w:style w:type="paragraph" w:customStyle="1" w:styleId="where">
+    <w:name w:val="where"/>
+    <w:basedOn w:val="Normal"/>
+  </w:style>
+  <w:style w:type="paragraph" w:customStyle="1" w:styleId="status">
+    <w:name w:val="status"/>
+    <w:basedOn w:val="Normal"/>
+  </w:style>
   <w:style w:type="paragraph" w:customStyle="1" w:styleId="k1">
     <w:name w:val="k1"/>
     <w:basedOn w:val="Normal"/>
@@ -3510,6 +3907,22 @@
   </w:style>
   <w:style w:type="paragraph" w:customStyle="1" w:styleId="ix1">
     <w:name w:val="ix1"/>
+    <w:basedOn w:val="Normal"/>
+  </w:style>
+  <w:style w:type="paragraph" w:customStyle="1" w:styleId="name1">
+    <w:name w:val="name1"/>
+    <w:basedOn w:val="Normal"/>
+  </w:style>
+  <w:style w:type="paragraph" w:customStyle="1" w:styleId="what1">
+    <w:name w:val="what1"/>
+    <w:basedOn w:val="Normal"/>
+  </w:style>
+  <w:style w:type="paragraph" w:customStyle="1" w:styleId="where1">
+    <w:name w:val="where1"/>
+    <w:basedOn w:val="Normal"/>
+  </w:style>
+  <w:style w:type="paragraph" w:customStyle="1" w:styleId="status1">
+    <w:name w:val="status1"/>
     <w:basedOn w:val="Normal"/>
   </w:style>
   <w:style w:type="character" w:customStyle="1" w:styleId="button-sample1">
@@ -3531,7 +3944,7 @@
     <w:link w:val="HeaderChar"/>
     <w:uiPriority w:val="99"/>
     <w:unhideWhenUsed/>
-    <w:rsid w:val="001A6CC8"/>
+    <w:rsid w:val="007E540D"/>
     <w:pPr>
       <w:tabs>
         <w:tab w:val="center" w:pos="4680"/>
@@ -3544,7 +3957,7 @@
     <w:basedOn w:val="DefaultParagraphFont"/>
     <w:link w:val="Header"/>
     <w:uiPriority w:val="99"/>
-    <w:rsid w:val="001A6CC8"/>
+    <w:rsid w:val="007E540D"/>
     <w:rPr>
       <w:rFonts w:eastAsiaTheme="minorEastAsia"/>
       <w:sz w:val="24"/>
@@ -3557,7 +3970,7 @@
     <w:link w:val="FooterChar"/>
     <w:uiPriority w:val="99"/>
     <w:unhideWhenUsed/>
-    <w:rsid w:val="001A6CC8"/>
+    <w:rsid w:val="007E540D"/>
     <w:pPr>
       <w:tabs>
         <w:tab w:val="center" w:pos="4680"/>
@@ -3570,7 +3983,7 @@
     <w:basedOn w:val="DefaultParagraphFont"/>
     <w:link w:val="Footer"/>
     <w:uiPriority w:val="99"/>
-    <w:rsid w:val="001A6CC8"/>
+    <w:rsid w:val="007E540D"/>
     <w:rPr>
       <w:rFonts w:eastAsiaTheme="minorEastAsia"/>
       <w:sz w:val="24"/>

</xml_diff>